<commit_message>
Take Roland's edits to the costing note
Three changes, from the Word file he returned on 22 September:

- "Curiosa's own figure, which ROFT cannot know" loses its second half.
- Stage F names the Badge rather than the certificate.
- The server's monthly cost is Linda's and Heidi's to supply, not
  Roland's.

Applied to the markdown and the Word file regenerated from it, so the
two cannot drift. Flagged to him separately: lib/badges.ts is explicit
that a badge arrives when a module is finished and is "emphatically not
a qualification", so on the platform's own model it belongs earlier in
the flow than stage F. His call.

Co-Authored-By: Claude Opus 5 <noreply@anthropic.com>
</commit_message>
<xml_diff>
--- a/FOR-HEIDI-process-flow-and-costing.docx
+++ b/FOR-HEIDI-process-flow-and-costing.docx
@@ -317,7 +317,7 @@
                 <w:color w:val="1A1A1A"/>
                 <w:sz w:val="18"/>
               </w:rPr>
-              <w:t>Curiosa's own figure, which ROFT cannot know.</w:t>
+              <w:t>Curiosa's own figure</w:t>
             </w:r>
           </w:p>
         </w:tc>
@@ -954,7 +954,7 @@
                 <w:color w:val="1A1A1A"/>
                 <w:sz w:val="18"/>
               </w:rPr>
-              <w:t>EISA readiness, the sitting, the Statement of Results, the certificate</w:t>
+              <w:t>EISA readiness, the sitting, the Statement of Results, the Badge</w:t>
             </w:r>
           </w:p>
         </w:tc>
@@ -3093,7 +3093,7 @@
                 <w:color w:val="1A1A1A"/>
                 <w:sz w:val="18"/>
               </w:rPr>
-              <w:t>Roland, from the invoice</w:t>
+              <w:t>Linda/Heidi, from the invoice</w:t>
             </w:r>
           </w:p>
         </w:tc>

</xml_diff>